<commit_message>
Fix typos in Midoriya MOU v2
- "non-sublicense license" → "non-sublicensable license" (Section 4.2)
- "SIC goodwill" → "All goodwill" (Section 4.5)
</commit_message>
<xml_diff>
--- a/outputs/Business-SICT/Sales/Midoriya-MOU/20260316_MOU_SIC_Midoriya_v2.docx
+++ b/outputs/Business-SICT/Sales/Midoriya-MOU/20260316_MOU_SIC_Midoriya_v2.docx
@@ -20,16 +20,7 @@
           <w:bCs/>
           <w:u w:val="single"/>
         </w:rPr>
-        <w:t xml:space="preserve">Memorandum </w:t>
-      </w:r>
-      <w:r>
-        <w:rPr>
-          <w:rFonts w:ascii="Times New Roman" w:hAnsi="Times New Roman" w:cs="Times New Roman"/>
-          <w:b/>
-          <w:bCs/>
-          <w:u w:val="single"/>
-        </w:rPr>
-        <w:t>of Understanding</w:t>
+        <w:t>Memorandum of Understanding</w:t>
       </w:r>
     </w:p>
     <w:p>
@@ -60,13 +51,7 @@
         <w:rPr>
           <w:sz w:val="20"/>
         </w:rPr>
-        <w:t>”) is effective as of</w:t>
-      </w:r>
-      <w:r>
-        <w:rPr>
-          <w:sz w:val="20"/>
-        </w:rPr>
-        <w:t xml:space="preserve"> </w:t>
+        <w:t xml:space="preserve">”) is effective as of </w:t>
       </w:r>
       <w:r>
         <w:rPr>
@@ -74,34 +59,92 @@
           <w:bCs/>
           <w:sz w:val="20"/>
         </w:rPr>
-        <w:t>Insert date</w:t>
-      </w:r>
-      <w:r>
-        <w:rPr>
+        <w:t xml:space="preserve">Insert date </w:t>
+      </w:r>
+      <w:r>
+        <w:rPr>
+          <w:sz w:val="20"/>
+        </w:rPr>
+        <w:t>(“</w:t>
+      </w:r>
+      <w:r>
+        <w:rPr>
+          <w:b/>
+          <w:sz w:val="20"/>
+        </w:rPr>
+        <w:t>Effective Date</w:t>
+      </w:r>
+      <w:r>
+        <w:rPr>
+          <w:sz w:val="20"/>
+        </w:rPr>
+        <w:t>”).</w:t>
+      </w:r>
+    </w:p>
+    <w:p>
+      <w:pPr>
+        <w:ind w:left="1440" w:hanging="1440"/>
+        <w:jc w:val="thaiDistribute"/>
+        <w:rPr>
+          <w:rFonts w:ascii="Times New Roman" w:hAnsi="Times New Roman" w:cs="Times New Roman"/>
+          <w:sz w:val="20"/>
+          <w:szCs w:val="20"/>
+        </w:rPr>
+      </w:pPr>
+      <w:r>
+        <w:rPr>
+          <w:rFonts w:ascii="Times New Roman" w:hAnsi="Times New Roman" w:cs="Times New Roman"/>
           <w:b/>
           <w:bCs/>
           <w:sz w:val="20"/>
-        </w:rPr>
-        <w:t xml:space="preserve"> </w:t>
-      </w:r>
-      <w:r>
-        <w:rPr>
-          <w:sz w:val="20"/>
-        </w:rPr>
-        <w:t>(“</w:t>
-      </w:r>
-      <w:r>
-        <w:rPr>
+          <w:szCs w:val="20"/>
+        </w:rPr>
+        <w:t>BETWEEN</w:t>
+      </w:r>
+      <w:r>
+        <w:rPr>
+          <w:rFonts w:ascii="Times New Roman" w:hAnsi="Times New Roman" w:cs="Times New Roman"/>
+          <w:sz w:val="20"/>
+          <w:szCs w:val="20"/>
+        </w:rPr>
+        <w:t>:</w:t>
+        <w:tab/>
+      </w:r>
+      <w:r>
+        <w:rPr>
+          <w:rFonts w:ascii="Times New Roman" w:hAnsi="Times New Roman" w:cs="Times New Roman"/>
           <w:b/>
-          <w:sz w:val="20"/>
-        </w:rPr>
-        <w:t>Effective Date</w:t>
-      </w:r>
-      <w:r>
-        <w:rPr>
-          <w:sz w:val="20"/>
-        </w:rPr>
-        <w:t>”).</w:t>
+          <w:bCs/>
+          <w:sz w:val="20"/>
+          <w:szCs w:val="20"/>
+        </w:rPr>
+        <w:t>Silicon Craft Technology Public Company Limited</w:t>
+      </w:r>
+      <w:r>
+        <w:rPr>
+          <w:rFonts w:ascii="Times New Roman" w:hAnsi="Times New Roman" w:cs="Times New Roman"/>
+          <w:sz w:val="20"/>
+          <w:szCs w:val="20"/>
+        </w:rPr>
+        <w:t xml:space="preserve"> (“</w:t>
+      </w:r>
+      <w:r>
+        <w:rPr>
+          <w:rFonts w:ascii="Times New Roman" w:hAnsi="Times New Roman" w:cs="Times New Roman"/>
+          <w:b/>
+          <w:bCs/>
+          <w:sz w:val="20"/>
+          <w:szCs w:val="20"/>
+        </w:rPr>
+        <w:t>SIC</w:t>
+      </w:r>
+      <w:r>
+        <w:rPr>
+          <w:rFonts w:ascii="Times New Roman" w:hAnsi="Times New Roman" w:cs="Times New Roman"/>
+          <w:sz w:val="20"/>
+          <w:szCs w:val="20"/>
+        </w:rPr>
+        <w:t>” hereafter), a corporation organized and existing under the laws of Thailand, with its head office located at No. 40 Thetsaban Rangsan Nua Road, Ladyao, Chatuchak, Bangkok, 10900, Thailand.</w:t>
       </w:r>
     </w:p>
     <w:p>
@@ -122,7 +165,7 @@
           <w:sz w:val="20"/>
           <w:szCs w:val="20"/>
         </w:rPr>
-        <w:t>BETWEEN</w:t>
+        <w:t>AND</w:t>
       </w:r>
       <w:r>
         <w:rPr>
@@ -131,13 +174,6 @@
           <w:szCs w:val="20"/>
         </w:rPr>
         <w:t>:</w:t>
-      </w:r>
-      <w:r>
-        <w:rPr>
-          <w:rFonts w:ascii="Times New Roman" w:hAnsi="Times New Roman" w:cs="Times New Roman"/>
-          <w:sz w:val="20"/>
-          <w:szCs w:val="20"/>
-        </w:rPr>
         <w:tab/>
       </w:r>
       <w:r>
@@ -148,7 +184,7 @@
           <w:sz w:val="20"/>
           <w:szCs w:val="20"/>
         </w:rPr>
-        <w:t>Silicon Craft Technology Public Company Limited</w:t>
+        <w:t>Midoriya Electric Co., Ltd.</w:t>
       </w:r>
       <w:r>
         <w:rPr>
@@ -166,36 +202,19 @@
           <w:sz w:val="20"/>
           <w:szCs w:val="20"/>
         </w:rPr>
-        <w:t>SIC</w:t>
-      </w:r>
-      <w:r>
-        <w:rPr>
-          <w:rFonts w:ascii="Times New Roman" w:hAnsi="Times New Roman" w:cs="Times New Roman"/>
-          <w:sz w:val="20"/>
-          <w:szCs w:val="20"/>
-        </w:rPr>
-        <w:t>” hereafter), a corporation organized and</w:t>
-      </w:r>
-      <w:r>
-        <w:rPr>
-          <w:rFonts w:ascii="Times New Roman" w:hAnsi="Times New Roman" w:cs="Times New Roman"/>
-          <w:sz w:val="20"/>
-          <w:szCs w:val="20"/>
-        </w:rPr>
-        <w:t xml:space="preserve"> existing under the laws of Thailand, with its head office located at</w:t>
-      </w:r>
-      <w:r>
-        <w:rPr>
-          <w:rFonts w:ascii="Times New Roman" w:hAnsi="Times New Roman" w:cs="Times New Roman"/>
-          <w:sz w:val="20"/>
-          <w:szCs w:val="20"/>
-        </w:rPr>
-        <w:t xml:space="preserve"> No. 40 Thetsaban Rangsan Nua Road, Ladyao, Chatuchak, Bangkok, 10900, Thailand.</w:t>
-      </w:r>
-    </w:p>
-    <w:p>
-      <w:pPr>
-        <w:ind w:left="1440" w:hanging="1440"/>
+        <w:t>Midoriya</w:t>
+      </w:r>
+      <w:r>
+        <w:rPr>
+          <w:rFonts w:ascii="Times New Roman" w:hAnsi="Times New Roman" w:cs="Times New Roman"/>
+          <w:sz w:val="20"/>
+          <w:szCs w:val="20"/>
+        </w:rPr>
+        <w:t>” hereafter), a corporation organized and existing under the laws of Japan, with its head office located at 1-2-6 Nihonbashi-muromachi, Chuo-ku, Tokyo 103-8301 Japan.</w:t>
+      </w:r>
+    </w:p>
+    <w:p>
+      <w:pPr>
         <w:jc w:val="thaiDistribute"/>
         <w:rPr>
           <w:rFonts w:ascii="Times New Roman" w:hAnsi="Times New Roman" w:cs="Times New Roman"/>
@@ -206,72 +225,10 @@
       <w:r>
         <w:rPr>
           <w:rFonts w:ascii="Times New Roman" w:hAnsi="Times New Roman" w:cs="Times New Roman"/>
-          <w:b/>
-          <w:bCs/>
-          <w:sz w:val="20"/>
-          <w:szCs w:val="20"/>
-        </w:rPr>
-        <w:t>AND</w:t>
-      </w:r>
-      <w:r>
-        <w:rPr>
-          <w:rFonts w:ascii="Times New Roman" w:hAnsi="Times New Roman" w:cs="Times New Roman"/>
-          <w:sz w:val="20"/>
-          <w:szCs w:val="20"/>
-        </w:rPr>
-        <w:t>:</w:t>
-      </w:r>
-      <w:r>
-        <w:rPr>
-          <w:rFonts w:ascii="Times New Roman" w:hAnsi="Times New Roman" w:cs="Times New Roman"/>
-          <w:sz w:val="20"/>
-          <w:szCs w:val="20"/>
-        </w:rPr>
-        <w:tab/>
-      </w:r>
-      <w:r>
-        <w:rPr>
-          <w:rFonts w:ascii="Times New Roman" w:hAnsi="Times New Roman" w:cs="Times New Roman"/>
-          <w:b/>
-          <w:bCs/>
-          <w:sz w:val="20"/>
-          <w:szCs w:val="20"/>
-        </w:rPr>
-        <w:t>Midoriya Electric Co., Ltd.</w:t>
-      </w:r>
-      <w:r>
-        <w:rPr>
-          <w:rFonts w:ascii="Times New Roman" w:hAnsi="Times New Roman" w:cs="Times New Roman"/>
-          <w:sz w:val="20"/>
-          <w:szCs w:val="20"/>
-        </w:rPr>
-        <w:t xml:space="preserve"> (“</w:t>
-      </w:r>
-      <w:r>
-        <w:rPr>
-          <w:rFonts w:ascii="Times New Roman" w:hAnsi="Times New Roman" w:cs="Times New Roman"/>
-          <w:b/>
-          <w:bCs/>
-          <w:sz w:val="20"/>
-          <w:szCs w:val="20"/>
-        </w:rPr>
-        <w:t>Midoriya</w:t>
-      </w:r>
-      <w:r>
-        <w:rPr>
-          <w:rFonts w:ascii="Times New Roman" w:hAnsi="Times New Roman" w:cs="Times New Roman"/>
-          <w:sz w:val="20"/>
-          <w:szCs w:val="20"/>
-        </w:rPr>
-        <w:t xml:space="preserve">” hereafter), a corporation organized and existing under the laws of Japan, with its head office located at </w:t>
-      </w:r>
-      <w:r>
-        <w:rPr>
-          <w:rFonts w:ascii="Times New Roman" w:hAnsi="Times New Roman" w:cs="Times New Roman"/>
-          <w:sz w:val="20"/>
-          <w:szCs w:val="20"/>
-        </w:rPr>
-        <w:t>1-2-6 Nihonbashi-muromachi, Chuo-ku, Tokyo 103-8301 Japan.</w:t>
+          <w:sz w:val="20"/>
+          <w:szCs w:val="20"/>
+        </w:rPr>
+        <w:t>Where appropriate each of these Parties will hereinafter individually be referred to as “Party” and collectively be referred to as the “Parties”.</w:t>
       </w:r>
     </w:p>
     <w:p>
@@ -289,41 +246,7 @@
           <w:sz w:val="20"/>
           <w:szCs w:val="20"/>
         </w:rPr>
-        <w:t xml:space="preserve">Where appropriate each of these Parties will hereinafter individually be referred to as “Party” </w:t>
-      </w:r>
-      <w:r>
-        <w:rPr>
-          <w:rFonts w:ascii="Times New Roman" w:hAnsi="Times New Roman" w:cs="Times New Roman"/>
-          <w:sz w:val="20"/>
-          <w:szCs w:val="20"/>
-        </w:rPr>
-        <w:t>and collectively be referred to as the “Parties”.</w:t>
-      </w:r>
-    </w:p>
-    <w:p>
-      <w:pPr>
-        <w:jc w:val="thaiDistribute"/>
-        <w:rPr>
-          <w:rFonts w:ascii="Times New Roman" w:hAnsi="Times New Roman" w:cs="Times New Roman"/>
-          <w:sz w:val="20"/>
-          <w:szCs w:val="20"/>
-        </w:rPr>
-      </w:pPr>
-      <w:r>
-        <w:rPr>
-          <w:rFonts w:ascii="Times New Roman" w:hAnsi="Times New Roman" w:cs="Times New Roman"/>
-          <w:sz w:val="20"/>
-          <w:szCs w:val="20"/>
-        </w:rPr>
-        <w:t xml:space="preserve">In consideration of the covenants and conditions contained </w:t>
-      </w:r>
-      <w:r>
-        <w:rPr>
-          <w:rFonts w:ascii="Times New Roman" w:hAnsi="Times New Roman" w:cs="Times New Roman"/>
-          <w:sz w:val="20"/>
-          <w:szCs w:val="20"/>
-        </w:rPr>
-        <w:t>herein, the Parties hereby agree to the following:</w:t>
+        <w:t>In consideration of the covenants and conditions contained herein, the Parties hereby agree to the following:</w:t>
       </w:r>
     </w:p>
     <w:p>
@@ -350,23 +273,7 @@
           <w:sz w:val="20"/>
           <w:szCs w:val="20"/>
         </w:rPr>
-        <w:t xml:space="preserve">The purpose of this MOU is to </w:t>
-      </w:r>
-      <w:r>
-        <w:rPr>
-          <w:rFonts w:ascii="Times New Roman" w:hAnsi="Times New Roman" w:cs="Times New Roman"/>
-          <w:sz w:val="20"/>
-          <w:szCs w:val="20"/>
-        </w:rPr>
-        <w:t xml:space="preserve">establish a framework </w:t>
-      </w:r>
-      <w:r>
-        <w:rPr>
-          <w:rFonts w:ascii="Times New Roman" w:hAnsi="Times New Roman" w:cs="Times New Roman"/>
-          <w:sz w:val="20"/>
-          <w:szCs w:val="20"/>
-        </w:rPr>
-        <w:t>for the Parties to collaborate on conduct</w:t>
+        <w:t>The purpose of this MOU is to establish a framework for the Parties to collaborate on conduct</w:t>
       </w:r>
       <w:r>
         <w:rPr>
@@ -382,31 +289,7 @@
           <w:sz w:val="20"/>
           <w:szCs w:val="20"/>
         </w:rPr>
-        <w:t xml:space="preserve"> </w:t>
-      </w:r>
-      <w:r>
-        <w:rPr>
-          <w:rFonts w:ascii="Times New Roman" w:hAnsi="Times New Roman" w:cs="Times New Roman"/>
-          <w:sz w:val="20"/>
-          <w:szCs w:val="20"/>
-        </w:rPr>
-        <w:t xml:space="preserve">marketing activities of SIC’s products </w:t>
-      </w:r>
-      <w:r>
-        <w:rPr>
-          <w:rFonts w:ascii="Times New Roman" w:hAnsi="Times New Roman" w:cs="Times New Roman"/>
-          <w:sz w:val="20"/>
-          <w:szCs w:val="20"/>
-        </w:rPr>
-        <w:t xml:space="preserve">that are identified in Annex I (the “Products”), in </w:t>
-      </w:r>
-      <w:r>
-        <w:rPr>
-          <w:rFonts w:ascii="Times New Roman" w:hAnsi="Times New Roman" w:cs="Times New Roman"/>
-          <w:sz w:val="20"/>
-          <w:szCs w:val="20"/>
-        </w:rPr>
-        <w:t>Japan (the “Territory”), subject to the terms and conditions herein.</w:t>
+        <w:t xml:space="preserve"> marketing activities of SIC’s products that are identified in Annex I (the “Products”), in Japan (the “Territory”), subject to the terms and conditions herein.</w:t>
       </w:r>
     </w:p>
     <w:p>
@@ -443,21 +326,7 @@
           <w:b w:val="0"/>
           <w:bCs w:val="0"/>
         </w:rPr>
-        <w:t xml:space="preserve">Midoriya </w:t>
-      </w:r>
-      <w:r>
-        <w:rPr>
-          <w:b w:val="0"/>
-          <w:bCs w:val="0"/>
-        </w:rPr>
-        <w:t xml:space="preserve">shall be responsible for marketing the Products in the Territory </w:t>
-      </w:r>
-      <w:r>
-        <w:rPr>
-          <w:b w:val="0"/>
-          <w:bCs w:val="0"/>
-        </w:rPr>
-        <w:t>at Midoriya’s sole cost and expense.</w:t>
+        <w:t>Midoriya shall be responsible for marketing the Products in the Territory at Midoriya’s sole cost and expense.</w:t>
       </w:r>
     </w:p>
     <w:p>
@@ -489,70 +358,7 @@
           <w:b w:val="0"/>
           <w:bCs w:val="0"/>
         </w:rPr>
-        <w:t xml:space="preserve">SIC grants Midoriya a limited, revocable, non-exclusive, non-transferable, and non-sublicensable right to publish the Products </w:t>
-      </w:r>
-      <w:r>
-        <w:rPr>
-          <w:b w:val="0"/>
-          <w:bCs w:val="0"/>
-        </w:rPr>
-        <w:t xml:space="preserve">details </w:t>
-      </w:r>
-      <w:r>
-        <w:rPr>
-          <w:b w:val="0"/>
-          <w:bCs w:val="0"/>
-        </w:rPr>
-        <w:t xml:space="preserve">on website “insert website” </w:t>
-      </w:r>
-      <w:r>
-        <w:rPr>
-          <w:b w:val="0"/>
-          <w:bCs w:val="0"/>
-        </w:rPr>
-        <w:t xml:space="preserve">in the Territory for </w:t>
-      </w:r>
-      <w:r>
-        <w:rPr>
-          <w:b w:val="0"/>
-          <w:bCs w:val="0"/>
-        </w:rPr>
-        <w:t xml:space="preserve">a period </w:t>
-      </w:r>
-      <w:r>
-        <w:rPr>
-          <w:b w:val="0"/>
-          <w:bCs w:val="0"/>
-        </w:rPr>
-        <w:t xml:space="preserve">of one (1) year at a time, subject to SIC’s prior </w:t>
-      </w:r>
-      <w:r>
-        <w:rPr>
-          <w:b w:val="0"/>
-          <w:bCs w:val="0"/>
-        </w:rPr>
-        <w:t>review</w:t>
-      </w:r>
-      <w:r>
-        <w:rPr>
-          <w:b w:val="0"/>
-          <w:bCs w:val="0"/>
-        </w:rPr>
-        <w:t xml:space="preserve">ed and </w:t>
-      </w:r>
-      <w:r>
-        <w:rPr>
-          <w:b w:val="0"/>
-          <w:bCs w:val="0"/>
-        </w:rPr>
-        <w:t>written approval.</w:t>
-      </w:r>
-      <w:r>
-        <w:rPr>
-          <w:b w:val="0"/>
-          <w:bCs w:val="0"/>
-        </w:rPr>
-        <w:t xml:space="preserve"> </w:t>
+        <w:t xml:space="preserve">SIC grants Midoriya a limited, revocable, non-exclusive, non-transferable, and non-sublicensable right to publish the Products details on website “insert website” in the Territory for a period of one (1) year at a time, subject to SIC’s prior reviewed and written approval. </w:t>
       </w:r>
     </w:p>
     <w:p>
@@ -572,28 +378,7 @@
           <w:b w:val="0"/>
           <w:bCs w:val="0"/>
         </w:rPr>
-        <w:t>At the end of each annual period</w:t>
-      </w:r>
-      <w:r>
-        <w:rPr>
-          <w:b w:val="0"/>
-          <w:bCs w:val="0"/>
-        </w:rPr>
-        <w:t>, Midoriya must request renewed approval from SIC to continue publishing the Products</w:t>
-      </w:r>
-      <w:r>
-        <w:rPr>
-          <w:b w:val="0"/>
-          <w:bCs w:val="0"/>
-        </w:rPr>
-        <w:t xml:space="preserve"> details</w:t>
-      </w:r>
-      <w:r>
-        <w:rPr>
-          <w:b w:val="0"/>
-          <w:bCs w:val="0"/>
-        </w:rPr>
-        <w:t xml:space="preserve"> for the following year.</w:t>
+        <w:t>At the end of each annual period, Midoriya must request renewed approval from SIC to continue publishing the Products details for the following year.</w:t>
       </w:r>
     </w:p>
     <w:p>
@@ -613,14 +398,7 @@
           <w:b w:val="0"/>
           <w:bCs w:val="0"/>
         </w:rPr>
-        <w:t>SIC</w:t>
-      </w:r>
-      <w:r>
-        <w:rPr>
-          <w:b w:val="0"/>
-          <w:bCs w:val="0"/>
-        </w:rPr>
-        <w:t xml:space="preserve"> may withhold or revoke approval at its sole discretion.</w:t>
+        <w:t>SIC may withhold or revoke approval at its sole discretion.</w:t>
       </w:r>
     </w:p>
     <w:p>
@@ -816,21 +594,7 @@
           <w:b w:val="0"/>
           <w:bCs w:val="0"/>
         </w:rPr>
-        <w:t>All intellectual property in the Products and SIC’s trademarks and log</w:t>
-      </w:r>
-      <w:r>
-        <w:rPr>
-          <w:b w:val="0"/>
-          <w:bCs w:val="0"/>
-        </w:rPr>
-        <w:t>o</w:t>
-      </w:r>
-      <w:r>
-        <w:rPr>
-          <w:b w:val="0"/>
-          <w:bCs w:val="0"/>
-        </w:rPr>
-        <w:t>s (the “SIC Marks”) remains the exclusive property of SIC.</w:t>
+        <w:t>All intellectual property in the Products and SIC’s trademarks and logos (the “SIC Marks”) remains the exclusive property of SIC.</w:t>
       </w:r>
     </w:p>
     <w:p>
@@ -863,14 +627,7 @@
           <w:b w:val="0"/>
           <w:bCs w:val="0"/>
         </w:rPr>
-        <w:t xml:space="preserve">SIC grants </w:t>
-      </w:r>
-      <w:r>
-        <w:rPr>
-          <w:b w:val="0"/>
-          <w:bCs w:val="0"/>
-        </w:rPr>
-        <w:t>Midoriya a limited, revocable, non-exclusive, non-sublicense license to use the SIC Marks solely for the marketing and publication activities permitted by this MOU and only within the Territory.</w:t>
+        <w:t>SIC grants Midoriya a limited, revocable, non-exclusive, non-sublicensable license to use the SIC Marks solely for the marketing and publication activities permitted by this MOU and only within the Territory.</w:t>
       </w:r>
     </w:p>
     <w:p>
@@ -882,10 +639,7 @@
         </w:numPr>
       </w:pPr>
       <w:r>
-        <w:t>Approval</w:t>
-      </w:r>
-      <w:r>
-        <w:t xml:space="preserve"> </w:t>
+        <w:t xml:space="preserve">Approval </w:t>
       </w:r>
     </w:p>
     <w:p>
@@ -972,14 +726,7 @@
           <w:b w:val="0"/>
           <w:bCs w:val="0"/>
         </w:rPr>
-        <w:t>SIC goodwill arising from Midoriya’s use of the SIC Marks shall in</w:t>
-      </w:r>
-      <w:r>
-        <w:rPr>
-          <w:b w:val="0"/>
-          <w:bCs w:val="0"/>
-        </w:rPr>
-        <w:t>ure solely to SIC.</w:t>
+        <w:t>All goodwill arising from Midoriya’s use of the SIC Marks shall inure solely to SIC.</w:t>
       </w:r>
     </w:p>
     <w:p>
@@ -1146,23 +893,7 @@
           <w:b w:val="0"/>
           <w:bCs w:val="0"/>
         </w:rPr>
-        <w:t xml:space="preserve">In any case, the confidentiality obligation imposed by this </w:t>
-      </w:r>
-      <w:r>
-        <w:rPr>
-          <w:rFonts w:cs="Times New Roman"/>
-          <w:b w:val="0"/>
-          <w:bCs w:val="0"/>
-        </w:rPr>
-        <w:t>Section</w:t>
-      </w:r>
-      <w:r>
-        <w:rPr>
-          <w:rFonts w:cs="Times New Roman"/>
-          <w:b w:val="0"/>
-          <w:bCs w:val="0"/>
-        </w:rPr>
-        <w:t xml:space="preserve"> shall survive the termination or expiry of this MOU for a period of three (3) years from the termination or expiry of this MOU (as the case may be).</w:t>
+        <w:t>In any case, the confidentiality obligation imposed by this Section shall survive the termination or expiry of this MOU for a period of three (3) years from the termination or expiry of this MOU (as the case may be).</w:t>
       </w:r>
     </w:p>
     <w:p>
@@ -1216,15 +947,7 @@
           <w:sz w:val="20"/>
           <w:szCs w:val="20"/>
         </w:rPr>
-        <w:t>SIC disclaims all warranties except as expressly provided</w:t>
-      </w:r>
-      <w:r>
-        <w:rPr>
-          <w:rFonts w:ascii="Times New Roman" w:hAnsi="Times New Roman" w:cs="Times New Roman"/>
-          <w:sz w:val="20"/>
-          <w:szCs w:val="20"/>
-        </w:rPr>
-        <w:t>. Neither Party shall be liable for indirect or consequential damages.</w:t>
+        <w:t>SIC disclaims all warranties except as expressly provided. Neither Party shall be liable for indirect or consequential damages.</w:t>
       </w:r>
     </w:p>
     <w:p>
@@ -1319,14 +1042,7 @@
           <w:b w:val="0"/>
           <w:bCs w:val="0"/>
         </w:rPr>
-        <w:t>Upon termination, Midoriya shall stop all publication, cease all use of SIC Marks, and re</w:t>
-      </w:r>
-      <w:r>
-        <w:rPr>
-          <w:b w:val="0"/>
-          <w:bCs w:val="0"/>
-        </w:rPr>
-        <w:t>ferences to SIC and the Products.</w:t>
+        <w:t>Upon termination, Midoriya shall stop all publication, cease all use of SIC Marks, and references to SIC and the Products.</w:t>
       </w:r>
     </w:p>
     <w:p>
@@ -1353,15 +1069,7 @@
           <w:sz w:val="20"/>
           <w:szCs w:val="20"/>
         </w:rPr>
-        <w:t xml:space="preserve">This MOU is governed by </w:t>
-      </w:r>
-      <w:r>
-        <w:rPr>
-          <w:rFonts w:ascii="Times New Roman" w:hAnsi="Times New Roman" w:cs="Times New Roman"/>
-          <w:sz w:val="20"/>
-          <w:szCs w:val="20"/>
-        </w:rPr>
-        <w:t>Thai law. Both Parties shall strive to settle any dispute or claims arising from the interpretation or performance of the terms of this MOU through friendly good faith consultations.</w:t>
+        <w:t>This MOU is governed by Thai law. Both Parties shall strive to settle any dispute or claims arising from the interpretation or performance of the terms of this MOU through friendly good faith consultations.</w:t>
       </w:r>
       <w:r>
         <w:rPr>
@@ -1378,87 +1086,7 @@
           <w:sz w:val="20"/>
           <w:szCs w:val="20"/>
         </w:rPr>
-        <w:t xml:space="preserve">In case no settlement can be reached through consultations within twenty (20) days of the submission of such matter by one Party to the other, both Parties agree to, within thirty (30) days, submit the matter to the </w:t>
-      </w:r>
-      <w:r>
-        <w:rPr>
-          <w:rFonts w:ascii="Times New Roman" w:hAnsi="Times New Roman" w:cs="Times New Roman"/>
-          <w:sz w:val="20"/>
-          <w:szCs w:val="20"/>
-        </w:rPr>
-        <w:t>Thai</w:t>
-      </w:r>
-      <w:r>
-        <w:rPr>
-          <w:rFonts w:ascii="Times New Roman" w:hAnsi="Times New Roman" w:cs="Times New Roman"/>
-          <w:sz w:val="20"/>
-          <w:szCs w:val="20"/>
-        </w:rPr>
-        <w:t>land Arbitration Center (</w:t>
-      </w:r>
-      <w:r>
-        <w:rPr>
-          <w:rFonts w:ascii="Times New Roman" w:hAnsi="Times New Roman" w:cs="Times New Roman"/>
-          <w:sz w:val="20"/>
-          <w:szCs w:val="20"/>
-        </w:rPr>
-        <w:t>“</w:t>
-      </w:r>
-      <w:r>
-        <w:rPr>
-          <w:rFonts w:ascii="Times New Roman" w:hAnsi="Times New Roman" w:cs="Times New Roman"/>
-          <w:sz w:val="20"/>
-          <w:szCs w:val="20"/>
-        </w:rPr>
-        <w:t>THAC</w:t>
-      </w:r>
-      <w:r>
-        <w:rPr>
-          <w:rFonts w:ascii="Times New Roman" w:hAnsi="Times New Roman" w:cs="Times New Roman"/>
-          <w:sz w:val="20"/>
-          <w:szCs w:val="20"/>
-        </w:rPr>
-        <w:t>”</w:t>
-      </w:r>
-      <w:r>
-        <w:rPr>
-          <w:rFonts w:ascii="Times New Roman" w:hAnsi="Times New Roman" w:cs="Times New Roman"/>
-          <w:sz w:val="20"/>
-          <w:szCs w:val="20"/>
-        </w:rPr>
-        <w:t>)</w:t>
-      </w:r>
-      <w:r>
-        <w:rPr>
-          <w:rFonts w:ascii="Times New Roman" w:hAnsi="Times New Roman" w:cs="Times New Roman"/>
-          <w:sz w:val="20"/>
-          <w:szCs w:val="20"/>
-        </w:rPr>
-        <w:t xml:space="preserve"> to be settled under its arbitration rules by three (3) arbitrators. Two of whom shall be chosen by each </w:t>
-      </w:r>
-      <w:r>
-        <w:rPr>
-          <w:rFonts w:ascii="Times New Roman" w:hAnsi="Times New Roman" w:cs="Times New Roman"/>
-          <w:sz w:val="20"/>
-          <w:szCs w:val="20"/>
-        </w:rPr>
-        <w:t>of the Parties</w:t>
-      </w:r>
-      <w:r>
-        <w:rPr>
-          <w:rFonts w:ascii="Times New Roman" w:hAnsi="Times New Roman" w:cs="Times New Roman"/>
-          <w:sz w:val="20"/>
-          <w:szCs w:val="20"/>
-        </w:rPr>
-        <w:t xml:space="preserve"> and the third arbitrator shall be chosen by the two arbitrators. The arbitration proceedings shall be conducted in English and shall take place in Bangkok. The arbitral award shall be final and binding upon both Parties and shall be enfor</w:t>
-      </w:r>
-      <w:r>
-        <w:rPr>
-          <w:rFonts w:ascii="Times New Roman" w:hAnsi="Times New Roman" w:cs="Times New Roman"/>
-          <w:sz w:val="20"/>
-          <w:szCs w:val="20"/>
-        </w:rPr>
-        <w:t>ceable in accordance with its terms.</w:t>
+        <w:t>In case no settlement can be reached through consultations within twenty (20) days of the submission of such matter by one Party to the other, both Parties agree to, within thirty (30) days, submit the matter to the Thailand Arbitration Center (“THAC”) to be settled under its arbitration rules by three (3) arbitrators. Two of whom shall be chosen by each of the Parties and the third arbitrator shall be chosen by the two arbitrators. The arbitration proceedings shall be conducted in English and shall take place in Bangkok. The arbitral award shall be final and binding upon both Parties and shall be enforceable in accordance with its terms.</w:t>
       </w:r>
     </w:p>
     <w:p>
@@ -1486,14 +1114,7 @@
           <w:b w:val="0"/>
           <w:bCs w:val="0"/>
         </w:rPr>
-        <w:t>Neither this MOU nor any portion of its rights or obligations shall be assigned or otherwise transferred by either Party without the prior written consent of the other Party. This MOU shall be bi</w:t>
-      </w:r>
-      <w:r>
-        <w:rPr>
-          <w:b w:val="0"/>
-          <w:bCs w:val="0"/>
-        </w:rPr>
-        <w:t>nding and inure to the benefit of the Parties and their respective successors and permitted assigns.</w:t>
+        <w:t>Neither this MOU nor any portion of its rights or obligations shall be assigned or otherwise transferred by either Party without the prior written consent of the other Party. This MOU shall be binding and inure to the benefit of the Parties and their respective successors and permitted assigns.</w:t>
       </w:r>
     </w:p>
     <w:p>
@@ -1513,14 +1134,7 @@
           <w:b w:val="0"/>
           <w:bCs w:val="0"/>
         </w:rPr>
-        <w:t>This MOU contains the entire MOU between the Parties with respect to the subject matter thereof and supersedes all prior written and oral</w:t>
-      </w:r>
-      <w:r>
-        <w:rPr>
-          <w:b w:val="0"/>
-          <w:bCs w:val="0"/>
-        </w:rPr>
-        <w:t xml:space="preserve"> MOU, contract or agreement.</w:t>
+        <w:t>This MOU contains the entire MOU between the Parties with respect to the subject matter thereof and supersedes all prior written and oral MOU, contract or agreement.</w:t>
       </w:r>
     </w:p>
     <w:p>
@@ -1540,42 +1154,7 @@
           <w:b w:val="0"/>
           <w:bCs w:val="0"/>
         </w:rPr>
-        <w:t xml:space="preserve">If any </w:t>
-      </w:r>
-      <w:r>
-        <w:rPr>
-          <w:b w:val="0"/>
-          <w:bCs w:val="0"/>
-        </w:rPr>
-        <w:t>Section</w:t>
-      </w:r>
-      <w:r>
-        <w:rPr>
-          <w:b w:val="0"/>
-          <w:bCs w:val="0"/>
-        </w:rPr>
-        <w:t xml:space="preserve"> of this MOU is found to be illegal or </w:t>
-      </w:r>
-      <w:r>
-        <w:rPr>
-          <w:b w:val="0"/>
-          <w:bCs w:val="0"/>
-        </w:rPr>
-        <w:t xml:space="preserve">unenforceable, the other </w:t>
-      </w:r>
-      <w:r>
-        <w:rPr>
-          <w:b w:val="0"/>
-          <w:bCs w:val="0"/>
-        </w:rPr>
-        <w:t>Section</w:t>
-      </w:r>
-      <w:r>
-        <w:rPr>
-          <w:b w:val="0"/>
-          <w:bCs w:val="0"/>
-        </w:rPr>
-        <w:t>s shall remain effective and enforceable to the greatest extent permitted by law.</w:t>
+        <w:t>If any Section of this MOU is found to be illegal or unenforceable, the other Sections shall remain effective and enforceable to the greatest extent permitted by law.</w:t>
       </w:r>
     </w:p>
     <w:p>
@@ -1595,14 +1174,7 @@
           <w:b w:val="0"/>
           <w:bCs w:val="0"/>
         </w:rPr>
-        <w:t xml:space="preserve">No Section of </w:t>
-      </w:r>
-      <w:r>
-        <w:rPr>
-          <w:b w:val="0"/>
-          <w:bCs w:val="0"/>
-        </w:rPr>
-        <w:t>this MOU may be waived except by a writing executed by the Party against whom the waiver is to be effective. A Party’s failure to enforce any Section of this MOU shall</w:t>
+        <w:t>No Section of this MOU may be waived except by a writing executed by the Party against whom the waiver is to be effective. A Party’s failure to enforce any Section of this MOU shall</w:t>
       </w:r>
       <w:r>
         <w:t xml:space="preserve"> </w:t>
@@ -1663,21 +1235,7 @@
           <w:b w:val="0"/>
           <w:bCs w:val="0"/>
         </w:rPr>
-        <w:t>This MOU may be executed in counterparts, each of which is deemed an original, but all of which together constitute one and the same MOU.</w:t>
-      </w:r>
-      <w:r>
-        <w:rPr>
-          <w:b w:val="0"/>
-          <w:bCs w:val="0"/>
-        </w:rPr>
-        <w:t xml:space="preserve"> </w:t>
-      </w:r>
-      <w:r>
-        <w:rPr>
-          <w:b w:val="0"/>
-          <w:bCs w:val="0"/>
-        </w:rPr>
-        <w:t>In the event that any signature is delivered by an electronic signature process, such signature shall create a valid and binding obligation of the Party executing with the same force and effect as if such signature were a manually signed original thereof.</w:t>
+        <w:t>This MOU may be executed in counterparts, each of which is deemed an original, but all of which together constitute one and the same MOU. In the event that any signature is delivered by an electronic signature process, such signature shall create a valid and binding obligation of the Party executing with the same force and effect as if such signature were a manually signed original thereof.</w:t>
       </w:r>
     </w:p>
     <w:p>
@@ -1829,14 +1387,6 @@
                 <w:lang w:eastAsia="zh-TW"/>
               </w:rPr>
               <w:t> </w:t>
-            </w:r>
-            <w:r>
-              <w:rPr>
-                <w:rFonts w:ascii="Times New Roman" w:eastAsia="Times New Roman" w:hAnsi="Times New Roman" w:cs="Times New Roman"/>
-                <w:sz w:val="20"/>
-                <w:szCs w:val="20"/>
-                <w:lang w:eastAsia="zh-TW"/>
-              </w:rPr>
               <w:br/>
             </w:r>
             <w:r>
@@ -2414,16 +1964,7 @@
           <w:bCs/>
           <w:u w:val="single"/>
         </w:rPr>
-        <w:t>Annex I</w:t>
-      </w:r>
-      <w:r>
-        <w:rPr>
-          <w:rFonts w:ascii="Times New Roman" w:hAnsi="Times New Roman" w:cs="Times New Roman"/>
-          <w:b/>
-          <w:bCs/>
-          <w:u w:val="single"/>
-        </w:rPr>
-        <w:t xml:space="preserve"> Products</w:t>
+        <w:t>Annex I Products</w:t>
       </w:r>
     </w:p>
     <w:p>

</xml_diff>